<commit_message>
docs: fix задание ВКР sections 3-5 to match original template structure
Preserved exact structure of the original template, replacing Unity/Flutter
with Django 5.2/React 19 project details.

https://claude.ai/code/session_01D3hkvTwHu9An1jnGPvHyaS
</commit_message>
<xml_diff>
--- a/docs/zadanie_vkr.docx
+++ b/docs/zadanie_vkr.docx
@@ -588,7 +588,8 @@
         </w:rPr>
         <w:t>3 Исходные данные к ВКР</w:t>
         <w:tab/>
-        <w:t>Техническое задание на создание информационной системы мастерской «Кузница Кальрадия» (описание предметной области, номенклатура изделий, производственные процессы). Материалы преддипломной практики 2026 года. ГОСТ 34.601-90, ГОСТ 19.201-78.</w:t>
+        <w:t>Действующий веб-сервис мастерской «Кузница Кальрадия» (Django 5.2 / React 19, развёрнут в производственной среде, 2025). Материалы преддипломной практики 2026 года: техническое задание, тест-кейсы. ГОСТ 34.601-90, ГОСТ 19.201-78.</w:t>
+        <w:tab/>
       </w:r>
       <w:r>
         <w:rPr>
@@ -616,7 +617,7 @@
           <w:sz w:val="24"/>
           <w:szCs w:val="24"/>
         </w:rPr>
-        <w:t>4 Содержание пояснительной запискиВведение. Раздел 1 — анализ предметной области, аналоги, проектирование архитектуры. Раздел 2 — реализация серверной части на Django 5.2 / Python, клиентской части на React 19 / TypeScript, тестирование. Заключение, список литературы (9 источников), приложения А–Б.</w:t>
+        <w:t>4 Содержание пояснительной запискиВведение. Раздел 1 — анализ предметной области, аналоги, проектирование архитектуры. Раздел 2 — реализация на Django 5.2 / Python и React 19 / TypeScript, тестирование. Заключение, список литературы (15 источников), приложения А–Б.</w:t>
         <w:tab/>
       </w:r>
       <w:r>
@@ -645,8 +646,7 @@
           <w:sz w:val="24"/>
           <w:szCs w:val="24"/>
         </w:rPr>
-        <w:t>5 Перечень графического материала Презентация (10–12 слайдов). В тексте ПЗ: архитектурная схема системы уровня C4 (рисунок 1), диаграмма потока данных интеграции ВКонтакте–Telegram (рисунок 2), диаграмма вариантов использования UML (рисунок 3), скриншоты публичного каталога и панели управления (рисунки 4–5). Фрагменты исходного кода в приложениях А–Б.</w:t>
-        <w:tab/>
+        <w:t>5 Перечень графического материала Презентация (10–12 слайдов), архитектурная схема системы уровня C4, ER-диаграмма базы данных, диаграмма вариантов использования UML, схема интеграции ВКонтакте–Telegram, макеты страниц веб-интерфейса. В тексте ПЗ (рисунки 1–5) и приложениях А–Б.</w:t>
       </w:r>
       <w:r>
         <w:rPr>

</xml_diff>

<commit_message>
docs: restore original template values in задание ВКР sections 3-5
Keep same GOSTs (19.201-78, 19.701-90), 15 sources, appendices А–Ж,
figures 1–12 — only project-specific content replaced.

https://claude.ai/code/session_01D3hkvTwHu9An1jnGPvHyaS
</commit_message>
<xml_diff>
--- a/docs/zadanie_vkr.docx
+++ b/docs/zadanie_vkr.docx
@@ -588,7 +588,7 @@
         </w:rPr>
         <w:t>3 Исходные данные к ВКР</w:t>
         <w:tab/>
-        <w:t>Действующий веб-сервис мастерской «Кузница Кальрадия» (Django 5.2 / React 19, развёрнут в производственной среде, 2025). Материалы преддипломной практики 2026 года: техническое задание, тест-кейсы. ГОСТ 34.601-90, ГОСТ 19.201-78.</w:t>
+        <w:t>Действующий веб-сервис мастерской «Кузница Кальрадия» (НовГУ, 2025), реализация на Django 5.2 / React 19. Материалы преддипломной практики 2026 года: техническое задание, тест-кейсы. ГОСТ 19.201-78, ГОСТ 19.701-90.</w:t>
         <w:tab/>
       </w:r>
       <w:r>
@@ -617,7 +617,7 @@
           <w:sz w:val="24"/>
           <w:szCs w:val="24"/>
         </w:rPr>
-        <w:t>4 Содержание пояснительной запискиВведение. Раздел 1 — анализ предметной области, аналоги, проектирование архитектуры. Раздел 2 — реализация на Django 5.2 / Python и React 19 / TypeScript, тестирование. Заключение, список литературы (15 источников), приложения А–Б.</w:t>
+        <w:t>4 Содержание пояснительной запискиВведение. Раздел 1 — анализ предметной области, аналоги, проектирование архитектуры. Раздел 2 — реализация на Django 5.2 / Python и React 19 / TypeScript, тестирование. Заключение, список литературы (15 источников), приложения А–Ж.</w:t>
         <w:tab/>
       </w:r>
       <w:r>
@@ -646,7 +646,7 @@
           <w:sz w:val="24"/>
           <w:szCs w:val="24"/>
         </w:rPr>
-        <w:t>5 Перечень графического материала Презентация (10–12 слайдов), архитектурная схема системы уровня C4, ER-диаграмма базы данных, диаграмма вариантов использования UML, схема интеграции ВКонтакте–Telegram, макеты страниц веб-интерфейса. В тексте ПЗ (рисунки 1–5) и приложениях А–Б.</w:t>
+        <w:t>5 Перечень графического материала Презентация (10–12 слайдов), диаграммы C4, ER, UML вариантов использования, схема интеграции ВКонтакте–Telegram, макеты страниц. В тексте ПЗ (рисунки 1–12) и приложениях А–Б.</w:t>
       </w:r>
       <w:r>
         <w:rPr>

</xml_diff>